<commit_message>
KAIS_short: add the search-strategy table as Table 1 and adjust the data section
Co-Authored-By: Claude Fable 5.1 <noreply@anthropic.com>
Claude-Session: https://claude.ai/code/session_01SvckvZxt3hAXTDPnm8YPEC
</commit_message>
<xml_diff>
--- a/journal/manuscript_v24_ko_KAIS_short.docx
+++ b/journal/manuscript_v24_ko_KAIS_short.docx
@@ -380,10 +380,7 @@
         <w:pStyle w:val="FirstParagraph"/>
       </w:pPr>
       <w:r>
-        <w:t xml:space="preserve">자료는 PATSTAT Global 2025년판에서 가져왔다[37]. CPC H01L21 또는 H01L24 계열 기호를 하나 이상 가진 출원 가운데 영문 제목에</w:t>
-      </w:r>
-      <w:r>
-        <w:t xml:space="preserve"> </w:t>
+        <w:t xml:space="preserve">자료는 PATSTAT Global 2025년판에서 가져왔다[37]. Table 1의 검색 전략에 따라 CPC H01L21 또는 H01L24 계열 기호를 하나 이상 가진 출원을 후보로 한정한 뒤, 영문 제목을 소문자로 바꾸어 지정 키워드(</w:t>
       </w:r>
       <w:r>
         <w:rPr>
@@ -445,18 +442,7 @@
         <w:t xml:space="preserve">metal-oxide bond</w:t>
       </w:r>
       <w:r>
-        <w:t xml:space="preserve"> </w:t>
-      </w:r>
-      <w:r>
-        <w:t xml:space="preserve">중 하나 이상이 들어 있는 출원을 남겼다. 출원–CPC 쌍 5,277건을 출원 식별자별로 집계하면 1968–2024년의 928건이 되며, 분석단위는 개별 특허출원이다. 추출 단계에서 두 클래스 밖의 기호는 보존되지 않았으므로 모든 기호는 H01L21 계열(202개)과 H01L24 계열(60개)의 서브그룹 기호 262개다. 이 광의의 표본은 현대의 하이브리드 본딩뿐 아니라 초기 직접 접합 전구 기술을 함께 포착한다. 본 연구는 H01L21을 전공정 그 자체로 보지 않는다. 표본의 H01L21 계열 기호 1,636건 가운데 조립 단계 공정(패키지 부품 제조, 실장·봉지, 리드 부착, 다이싱)이 403건(24.6%)이며, 그럼에도 하이브리드 본딩의 성능을 좌우하는 웨이퍼 준비, 표면 처리, 평탄화가 H01L21에 다수 포함되고 접합·인터커넥트 기술은 H01L24에 모여 있으므로 두 클래스의 공동분류를 제조공정 영역과 접합 영역 사이의 경계 넘기를 재는 대리측정치로 쓴다.</w:t>
-      </w:r>
-    </w:p>
-    <w:p>
-      <w:pPr>
-        <w:pStyle w:val="BodyText"/>
-      </w:pPr>
-      <w:r>
-        <w:t xml:space="preserve">Table 1은 변수를 정의한다. 기술범위(breadth)는 출원별 H01L21·H01L24 계열의 서로 다른 CPC 서브그룹 수로 분류 기호의 수로 범위를 재는 Lerner[29]의 방식을 두 클래스 안에 적용한 것이다. 통합형은 최소 breadth가 2이고 단독형은 1이므로, 보유 클래스마다 최소 1개 기호를 차감한 유형 최소치 조정 CPC 범위(breadth_adj)를 탐색적 지표로 따로 둔다. 자료에 출원인 정보가 없으므로 출원청 계수는 관할권의 인과효과가 아니라 해당 출원청에 제출된 발명 포트폴리오의 조건부 구성 차이로 해석한다.</w:t>
+        <w:t xml:space="preserve">) 중 하나 이상이 들어 있는 출원만 남겼다. 두 조건을 모두 만족해야 하며, 검색에는 두 클래스의 인덱싱 코드도 썼으나 추출된 레코드에는 본 클래스의 기호만 보존되었다. 출원–CPC 쌍 5,277건을 출원 식별자별로 집계하면 1968–2024년의 928건이 되며, 분석단위는 개별 특허출원이다. 추출 단계에서 두 클래스 밖의 기호는 보존되지 않았으므로 모든 기호는 H01L21 계열(202개)과 H01L24 계열(60개)의 서브그룹 기호 262개다. 이 광의의 표본은 현대의 하이브리드 본딩뿐 아니라 초기 직접 접합 전구 기술을 함께 포착한다.</w:t>
       </w:r>
     </w:p>
     <w:p>
@@ -470,6 +456,448 @@
           <w:bCs/>
         </w:rPr>
         <w:t xml:space="preserve">Table 1.</w:t>
+      </w:r>
+      <w:r>
+        <w:t xml:space="preserve"> </w:t>
+      </w:r>
+      <w:r>
+        <w:t xml:space="preserve">Search strategy for hybrid-bonding-related applications</w:t>
+      </w:r>
+    </w:p>
+    <w:tbl>
+      <w:tblPr>
+        <w:tblStyle w:val="Table"/>
+        <w:tblW w:type="dxa" w:w="9069"/>
+        <w:tblLayout w:type="fixed"/>
+        <w:tblLook w:firstRow="1" w:lastRow="0" w:firstColumn="0" w:lastColumn="0" w:noHBand="0" w:noVBand="0" w:val="0020"/>
+        <w:tblCellMar>
+          <w:top w:w="20" w:type="dxa"/>
+          <w:bottom w:w="20" w:type="dxa"/>
+          <w:left w:w="60" w:type="dxa"/>
+          <w:right w:w="60" w:type="dxa"/>
+        </w:tblCellMar>
+        <w:tblBorders>
+          <w:top w:val="single" w:sz="8" w:space="0" w:color="000000"/>
+          <w:bottom w:val="single" w:sz="8" w:space="0" w:color="000000"/>
+          <w:left w:val="nil"/>
+          <w:right w:val="nil"/>
+          <w:insideH w:val="nil"/>
+          <w:insideV w:val="nil"/>
+        </w:tblBorders>
+      </w:tblPr>
+      <w:tblGrid>
+        <w:gridCol w:w="1587"/>
+        <w:gridCol w:w="2040"/>
+        <w:gridCol w:w="5442"/>
+      </w:tblGrid>
+      <w:tr>
+        <w:trPr>
+          <w:tblHeader w:val="on"/>
+          <w:cantSplit/>
+        </w:trPr>
+        <w:tc>
+          <w:tcPr>
+            <w:tcW w:type="dxa" w:w="1587"/>
+            <w:tcBorders>
+              <w:bottom w:val="single" w:sz="4" w:space="0" w:color="000000"/>
+            </w:tcBorders>
+          </w:tcPr>
+          <w:p>
+            <w:pPr>
+              <w:pStyle w:val="Compact"/>
+              <w:spacing w:before="20" w:after="20" w:line="240" w:lineRule="auto"/>
+              <w:keepNext/>
+            </w:pPr>
+            <w:r>
+              <w:rPr>
+                <w:sz w:val="18"/>
+                <w:szCs w:val="18"/>
+              </w:rPr>
+              <w:t xml:space="preserve">Step</w:t>
+            </w:r>
+          </w:p>
+        </w:tc>
+        <w:tc>
+          <w:tcPr>
+            <w:tcW w:type="dxa" w:w="2040"/>
+            <w:tcBorders>
+              <w:bottom w:val="single" w:sz="4" w:space="0" w:color="000000"/>
+            </w:tcBorders>
+          </w:tcPr>
+          <w:p>
+            <w:pPr>
+              <w:pStyle w:val="Compact"/>
+              <w:spacing w:before="20" w:after="20" w:line="240" w:lineRule="auto"/>
+              <w:keepNext/>
+            </w:pPr>
+            <w:r>
+              <w:rPr>
+                <w:sz w:val="18"/>
+                <w:szCs w:val="18"/>
+              </w:rPr>
+              <w:t xml:space="preserve">Condition</w:t>
+            </w:r>
+          </w:p>
+        </w:tc>
+        <w:tc>
+          <w:tcPr>
+            <w:tcW w:type="dxa" w:w="5442"/>
+            <w:tcBorders>
+              <w:bottom w:val="single" w:sz="4" w:space="0" w:color="000000"/>
+            </w:tcBorders>
+          </w:tcPr>
+          <w:p>
+            <w:pPr>
+              <w:pStyle w:val="Compact"/>
+              <w:spacing w:before="20" w:after="20" w:line="240" w:lineRule="auto"/>
+              <w:keepNext/>
+            </w:pPr>
+            <w:r>
+              <w:rPr>
+                <w:sz w:val="18"/>
+                <w:szCs w:val="18"/>
+              </w:rPr>
+              <w:t xml:space="preserve">Description</w:t>
+            </w:r>
+          </w:p>
+        </w:tc>
+      </w:tr>
+      <w:tr>
+        <w:trPr>
+          <w:cantSplit/>
+        </w:trPr>
+        <w:tc>
+          <w:tcPr>
+            <w:tcW w:type="dxa" w:w="1587"/>
+          </w:tcPr>
+          <w:p>
+            <w:pPr>
+              <w:pStyle w:val="Compact"/>
+              <w:spacing w:before="20" w:after="20" w:line="240" w:lineRule="auto"/>
+              <w:keepNext/>
+            </w:pPr>
+            <w:r>
+              <w:rPr>
+                <w:sz w:val="18"/>
+                <w:szCs w:val="18"/>
+              </w:rPr>
+              <w:t xml:space="preserve">CPC</w:t>
+            </w:r>
+          </w:p>
+        </w:tc>
+        <w:tc>
+          <w:tcPr>
+            <w:tcW w:type="dxa" w:w="2040"/>
+          </w:tcPr>
+          <w:p>
+            <w:pPr>
+              <w:pStyle w:val="Compact"/>
+              <w:spacing w:before="20" w:after="20" w:line="240" w:lineRule="auto"/>
+              <w:keepNext/>
+            </w:pPr>
+            <w:r>
+              <w:rPr>
+                <w:sz w:val="18"/>
+                <w:szCs w:val="18"/>
+              </w:rPr>
+              <w:t xml:space="preserve">H01L21</w:t>
+            </w:r>
+          </w:p>
+        </w:tc>
+        <w:tc>
+          <w:tcPr>
+            <w:tcW w:type="dxa" w:w="5442"/>
+          </w:tcPr>
+          <w:p>
+            <w:pPr>
+              <w:pStyle w:val="Compact"/>
+              <w:spacing w:before="20" w:after="20" w:line="240" w:lineRule="auto"/>
+              <w:keepNext/>
+            </w:pPr>
+            <w:r>
+              <w:rPr>
+                <w:sz w:val="18"/>
+                <w:szCs w:val="18"/>
+              </w:rPr>
+              <w:t xml:space="preserve">Processes and apparatus for manufacturing semiconductor devices, including wafer bonding (21/18, 21/20), isolation, interconnect and TSV (21/76), substrate and insulating-layer treatment (21/02), CMP (21/30–21/32); also assembly-stage processes (21/48, 21/50–21/58, 21/60, 21/78) and equipment (21/67–21/68)</w:t>
+            </w:r>
+          </w:p>
+        </w:tc>
+      </w:tr>
+      <w:tr>
+        <w:trPr>
+          <w:cantSplit/>
+        </w:trPr>
+        <w:tc>
+          <w:tcPr>
+            <w:tcW w:type="dxa" w:w="1587"/>
+          </w:tcPr>
+          <w:p>
+            <w:pPr>
+              <w:pStyle w:val="Compact"/>
+              <w:spacing w:before="20" w:after="20" w:line="240" w:lineRule="auto"/>
+              <w:keepNext/>
+            </w:pPr>
+            <w:r>
+              <w:rPr>
+                <w:sz w:val="18"/>
+                <w:szCs w:val="18"/>
+              </w:rPr>
+              <w:t xml:space="preserve">CPC</w:t>
+            </w:r>
+          </w:p>
+        </w:tc>
+        <w:tc>
+          <w:tcPr>
+            <w:tcW w:type="dxa" w:w="2040"/>
+          </w:tcPr>
+          <w:p>
+            <w:pPr>
+              <w:pStyle w:val="Compact"/>
+              <w:spacing w:before="20" w:after="20" w:line="240" w:lineRule="auto"/>
+              <w:keepNext/>
+            </w:pPr>
+            <w:r>
+              <w:rPr>
+                <w:sz w:val="18"/>
+                <w:szCs w:val="18"/>
+              </w:rPr>
+              <w:t xml:space="preserve">H01L24</w:t>
+            </w:r>
+          </w:p>
+        </w:tc>
+        <w:tc>
+          <w:tcPr>
+            <w:tcW w:type="dxa" w:w="5442"/>
+          </w:tcPr>
+          <w:p>
+            <w:pPr>
+              <w:pStyle w:val="Compact"/>
+              <w:spacing w:before="20" w:after="20" w:line="240" w:lineRule="auto"/>
+              <w:keepNext/>
+            </w:pPr>
+            <w:r>
+              <w:rPr>
+                <w:sz w:val="18"/>
+                <w:szCs w:val="18"/>
+              </w:rPr>
+              <w:t xml:space="preserve">Connector structures, bump, layer and wire connections, and related methods and apparatus for connecting or disconnecting semiconductor or solid-state bodies</w:t>
+            </w:r>
+          </w:p>
+        </w:tc>
+      </w:tr>
+      <w:tr>
+        <w:trPr>
+          <w:cantSplit/>
+        </w:trPr>
+        <w:tc>
+          <w:tcPr>
+            <w:tcW w:type="dxa" w:w="1587"/>
+          </w:tcPr>
+          <w:p>
+            <w:pPr>
+              <w:pStyle w:val="Compact"/>
+              <w:spacing w:before="20" w:after="20" w:line="240" w:lineRule="auto"/>
+              <w:keepNext/>
+            </w:pPr>
+            <w:r>
+              <w:rPr>
+                <w:sz w:val="18"/>
+                <w:szCs w:val="18"/>
+              </w:rPr>
+              <w:t xml:space="preserve">Keyword</w:t>
+            </w:r>
+          </w:p>
+        </w:tc>
+        <w:tc>
+          <w:tcPr>
+            <w:tcW w:type="dxa" w:w="2040"/>
+          </w:tcPr>
+          <w:p>
+            <w:pPr>
+              <w:pStyle w:val="Compact"/>
+              <w:spacing w:before="20" w:after="20" w:line="240" w:lineRule="auto"/>
+              <w:keepNext/>
+            </w:pPr>
+            <w:r>
+              <w:rPr>
+                <w:sz w:val="18"/>
+                <w:szCs w:val="18"/>
+              </w:rPr>
+              <w:t xml:space="preserve">Title</w:t>
+            </w:r>
+          </w:p>
+        </w:tc>
+        <w:tc>
+          <w:tcPr>
+            <w:tcW w:type="dxa" w:w="5442"/>
+          </w:tcPr>
+          <w:p>
+            <w:pPr>
+              <w:pStyle w:val="Compact"/>
+              <w:spacing w:before="20" w:after="20" w:line="240" w:lineRule="auto"/>
+              <w:keepNext/>
+            </w:pPr>
+            <w:r>
+              <w:rPr>
+                <w:sz w:val="18"/>
+                <w:szCs w:val="18"/>
+              </w:rPr>
+              <w:t xml:space="preserve">At least one of</w:t>
+            </w:r>
+            <w:r>
+              <w:rPr>
+                <w:sz w:val="18"/>
+                <w:szCs w:val="18"/>
+              </w:rPr>
+              <w:t xml:space="preserve"> </w:t>
+            </w:r>
+            <w:r>
+              <w:rPr>
+                <w:i/>
+                <w:iCs/>
+                <w:sz w:val="18"/>
+                <w:szCs w:val="18"/>
+              </w:rPr>
+              <w:t xml:space="preserve">hybrid bonding</w:t>
+            </w:r>
+            <w:r>
+              <w:rPr>
+                <w:sz w:val="18"/>
+                <w:szCs w:val="18"/>
+              </w:rPr>
+              <w:t xml:space="preserve">,</w:t>
+            </w:r>
+            <w:r>
+              <w:rPr>
+                <w:sz w:val="18"/>
+                <w:szCs w:val="18"/>
+              </w:rPr>
+              <w:t xml:space="preserve"> </w:t>
+            </w:r>
+            <w:r>
+              <w:rPr>
+                <w:i/>
+                <w:iCs/>
+                <w:sz w:val="18"/>
+                <w:szCs w:val="18"/>
+              </w:rPr>
+              <w:t xml:space="preserve">direct bonding</w:t>
+            </w:r>
+            <w:r>
+              <w:rPr>
+                <w:sz w:val="18"/>
+                <w:szCs w:val="18"/>
+              </w:rPr>
+              <w:t xml:space="preserve">,</w:t>
+            </w:r>
+            <w:r>
+              <w:rPr>
+                <w:sz w:val="18"/>
+                <w:szCs w:val="18"/>
+              </w:rPr>
+              <w:t xml:space="preserve"> </w:t>
+            </w:r>
+            <w:r>
+              <w:rPr>
+                <w:i/>
+                <w:iCs/>
+                <w:sz w:val="18"/>
+                <w:szCs w:val="18"/>
+              </w:rPr>
+              <w:t xml:space="preserve">Cu–Cu</w:t>
+            </w:r>
+            <w:r>
+              <w:rPr>
+                <w:sz w:val="18"/>
+                <w:szCs w:val="18"/>
+              </w:rPr>
+              <w:t xml:space="preserve">,</w:t>
+            </w:r>
+            <w:r>
+              <w:rPr>
+                <w:sz w:val="18"/>
+                <w:szCs w:val="18"/>
+              </w:rPr>
+              <w:t xml:space="preserve"> </w:t>
+            </w:r>
+            <w:r>
+              <w:rPr>
+                <w:i/>
+                <w:iCs/>
+                <w:sz w:val="18"/>
+                <w:szCs w:val="18"/>
+              </w:rPr>
+              <w:t xml:space="preserve">copper to copper</w:t>
+            </w:r>
+            <w:r>
+              <w:rPr>
+                <w:sz w:val="18"/>
+                <w:szCs w:val="18"/>
+              </w:rPr>
+              <w:t xml:space="preserve">,</w:t>
+            </w:r>
+            <w:r>
+              <w:rPr>
+                <w:sz w:val="18"/>
+                <w:szCs w:val="18"/>
+              </w:rPr>
+              <w:t xml:space="preserve"> </w:t>
+            </w:r>
+            <w:r>
+              <w:rPr>
+                <w:i/>
+                <w:iCs/>
+                <w:sz w:val="18"/>
+                <w:szCs w:val="18"/>
+              </w:rPr>
+              <w:t xml:space="preserve">metal-oxide bond</w:t>
+            </w:r>
+            <w:r>
+              <w:rPr>
+                <w:sz w:val="18"/>
+                <w:szCs w:val="18"/>
+              </w:rPr>
+              <w:t xml:space="preserve"> </w:t>
+            </w:r>
+            <w:r>
+              <w:rPr>
+                <w:sz w:val="18"/>
+                <w:szCs w:val="18"/>
+              </w:rPr>
+              <w:t xml:space="preserve">(both the CPC and the keyword condition must hold)</w:t>
+            </w:r>
+          </w:p>
+        </w:tc>
+      </w:tr>
+    </w:tbl>
+    <w:p>
+      <w:pPr>
+        <w:pStyle w:val="BodyText"/>
+      </w:pPr>
+      <w:r>
+        <w:t xml:space="preserve">Table 1이 보여주듯 H01L21에는 웨이퍼 제조공정 외에 조립 단계의 제조공정과 공정 장치도 포함되므로, 본 연구는 H01L21을 전공정 그 자체로 보지 않는다. 표본의 H01L21 계열 기호 1,636건 가운데 조립 단계 공정(패키지 부품 제조, 실장·봉지, 리드 부착, 다이싱)이 403건(24.6%)이며, 그럼에도 하이브리드 본딩의 성능을 좌우하는 웨이퍼 준비, 표면 처리, 평탄화가 H01L21에 다수 포함되고 접합·인터커넥트 기술은 H01L24에 모여 있으므로 두 클래스의 공동분류를 제조공정 영역과 접합 영역 사이의 경계 넘기를 재는 대리측정치로 쓴다.</w:t>
+      </w:r>
+    </w:p>
+    <w:p>
+      <w:pPr>
+        <w:pStyle w:val="BodyText"/>
+      </w:pPr>
+      <w:r>
+        <w:t xml:space="preserve">Table 2은 변수를 정의한다. 기술범위(breadth)는 출원별 H01L21·H01L24 계열의 서로 다른 CPC 서브그룹 수로 분류 기호의 수로 범위를 재는 Lerner[29]의 방식을 두 클래스 안에 적용한 것이다. 통합형은 최소 breadth가 2이고 단독형은 1이므로, 보유 클래스마다 최소 1개 기호를 차감한 유형 최소치 조정 CPC 범위(breadth_adj)를 탐색적 지표로 따로 둔다. 자료에 출원인 정보가 없으므로 출원청 계수는 관할권의 인과효과가 아니라 해당 출원청에 제출된 발명 포트폴리오의 조건부 구성 차이로 해석한다.</w:t>
+      </w:r>
+    </w:p>
+    <w:p>
+      <w:pPr>
+        <w:pStyle w:val="BodyText"/>
+        <w:keepNext/>
+      </w:pPr>
+      <w:r>
+        <w:rPr>
+          <w:b/>
+          <w:bCs/>
+        </w:rPr>
+        <w:t xml:space="preserve">Table 2.</w:t>
       </w:r>
       <w:r>
         <w:t xml:space="preserve"> </w:t>
@@ -1056,7 +1484,7 @@
         <w:pStyle w:val="BodyText"/>
       </w:pPr>
       <w:r>
-        <w:t xml:space="preserve">Table 2는 기술범위의 음이항 추정 결과다. 미국 출원청 기준으로 중국 출원청 출원은 기대 CPC 서브그룹 수가 약 21% 적고(IRR 0.785, p &lt; 0.01, 95% CI 0.695–0.887), PCT 경로 출원은 약 17% 적다(IRR 0.826, p &lt; 0.01). 한국, 대만, EPO는 미국과 다르지 않으며 일본은 10% 수준에서만 유의하다. 이 결과는 H3a를 지지한다. 출원연도의 IRR은 1.015이지만 2010년 이후 표본만 보면 부호가 반대로 바뀌므로(IRR 0.970, p &lt; 0.01) 범위의 시간 추세에 대해서는 결론을 내리지 않는다.</w:t>
+        <w:t xml:space="preserve">Table 3는 기술범위의 음이항 추정 결과다. 미국 출원청 기준으로 중국 출원청 출원은 기대 CPC 서브그룹 수가 약 21% 적고(IRR 0.785, p &lt; 0.01, 95% CI 0.695–0.887), PCT 경로 출원은 약 17% 적다(IRR 0.826, p &lt; 0.01). 한국, 대만, EPO는 미국과 다르지 않으며 일본은 10% 수준에서만 유의하다. 이 결과는 H3a를 지지한다. 출원연도의 IRR은 1.015이지만 2010년 이후 표본만 보면 부호가 반대로 바뀌므로(IRR 0.970, p &lt; 0.01) 범위의 시간 추세에 대해서는 결론을 내리지 않는다.</w:t>
       </w:r>
     </w:p>
     <w:p>
@@ -1069,7 +1497,7 @@
           <w:b/>
           <w:bCs/>
         </w:rPr>
-        <w:t xml:space="preserve">Table 2.</w:t>
+        <w:t xml:space="preserve">Table 3.</w:t>
       </w:r>
       <w:r>
         <w:t xml:space="preserve"> </w:t>
@@ -1883,7 +2311,7 @@
         <w:pStyle w:val="FirstParagraph"/>
       </w:pPr>
       <w:r>
-        <w:t xml:space="preserve">Table 3은 조립 단독형을 기준으로 한 다항 로짓이며, Fig. 2는 기술범위와 출원연도를 바꾸었을 때 세 유형의 평균 예측확률이다. 세부 분류가 하나 늘 때마다 통합형일 상대위험은 40% 높아지고(RRR 1.403, p &lt; 0.01, 95% CI 1.321–1.489) 공정 단독형일 상대위험은 10% 낮아지며(RRR 0.905, p &lt; 0.05), 기술범위가 3인 출원의 통합형 예측확률은 0.26이지만 8인 출원은 0.68이다. 유형과 기술범위가 같은 CPC 정보에서 만들어지므로 H1은 통합형의 구성적 특징으로서 지지된다. 공정 단독형의 상대위험은 해마다 약 8.7%씩 낮아지고(RRR 0.913, p &lt; 0.01, 95% CI 0.887–0.940) 통합형은 전 기간의 선형 추세로는 변하지 않는다(RRR 0.993). 2010년 출원의 공정 단독형 예측확률은 0.27, 2022년 출원은 0.12다. H2는 지지된다. 중국 출원청 출원은 공정 단독형일 상대위험이 2.7배 높고(RRR 2.687, p &lt; 0.01, 95% CI 1.566–4.611) PCT 경로도 높지만(RRR 1.997, p &lt; 0.05), 통합형 방정식에서는 어느 출원청 계수도 유의하지 않아 범위와 시점을 통제하면 경계를 넘는 특허의 비중 자체는 출원청 사이에 다르지 않다. 공정 단독형 평균 예측확률은 중국 출원청 0.255, 미국 출원청 0.143이다. 시기별로 보면 공정 단독형의 비중은 2014년 이전 43.6%에서 2015–2019년 14.8%, 2020–2024년 10.4%로 계속 줄었고, 통합형은 31.3%에서 62.2%로 늘었다가 44.3%로 낮아졌으며, 조립 단독형은 25.1%와 23.0%에서 45.4%로 늘었다. 기간 더미를 넣은 다항 로짓에서도 공정 단독형의 상대위험은 2014년 이전 대비 0.273과 0.101(모두 p &lt; 0.01)로 낮아지고 통합형은 1.707(p = 0.09)에서 0.762(비유의)로 내려온다.</w:t>
+        <w:t xml:space="preserve">Table 4은 조립 단독형을 기준으로 한 다항 로짓이며, Fig. 2는 기술범위와 출원연도를 바꾸었을 때 세 유형의 평균 예측확률이다. 세부 분류가 하나 늘 때마다 통합형일 상대위험은 40% 높아지고(RRR 1.403, p &lt; 0.01, 95% CI 1.321–1.489) 공정 단독형일 상대위험은 10% 낮아지며(RRR 0.905, p &lt; 0.05), 기술범위가 3인 출원의 통합형 예측확률은 0.26이지만 8인 출원은 0.68이다. 유형과 기술범위가 같은 CPC 정보에서 만들어지므로 H1은 통합형의 구성적 특징으로서 지지된다. 공정 단독형의 상대위험은 해마다 약 8.7%씩 낮아지고(RRR 0.913, p &lt; 0.01, 95% CI 0.887–0.940) 통합형은 전 기간의 선형 추세로는 변하지 않는다(RRR 0.993). 2010년 출원의 공정 단독형 예측확률은 0.27, 2022년 출원은 0.12다. H2는 지지된다. 중국 출원청 출원은 공정 단독형일 상대위험이 2.7배 높고(RRR 2.687, p &lt; 0.01, 95% CI 1.566–4.611) PCT 경로도 높지만(RRR 1.997, p &lt; 0.05), 통합형 방정식에서는 어느 출원청 계수도 유의하지 않아 범위와 시점을 통제하면 경계를 넘는 특허의 비중 자체는 출원청 사이에 다르지 않다. 공정 단독형 평균 예측확률은 중국 출원청 0.255, 미국 출원청 0.143이다. 시기별로 보면 공정 단독형의 비중은 2014년 이전 43.6%에서 2015–2019년 14.8%, 2020–2024년 10.4%로 계속 줄었고, 통합형은 31.3%에서 62.2%로 늘었다가 44.3%로 낮아졌으며, 조립 단독형은 25.1%와 23.0%에서 45.4%로 늘었다. 기간 더미를 넣은 다항 로짓에서도 공정 단독형의 상대위험은 2014년 이전 대비 0.273과 0.101(모두 p &lt; 0.01)로 낮아지고 통합형은 1.707(p = 0.09)에서 0.762(비유의)로 내려온다.</w:t>
       </w:r>
     </w:p>
     <w:p>
@@ -1896,7 +2324,7 @@
           <w:b/>
           <w:bCs/>
         </w:rPr>
-        <w:t xml:space="preserve">Table 3.</w:t>
+        <w:t xml:space="preserve">Table 4.</w:t>
       </w:r>
       <w:r>
         <w:t xml:space="preserve"> </w:t>
@@ -3472,7 +3900,7 @@
         <w:pStyle w:val="FirstParagraph"/>
       </w:pPr>
       <w:r>
-        <w:t xml:space="preserve">Table 4는 표본과 변수 정의를 바꾸어 다시 추정한 핵심 계수와 가설 판정이다. 같은 제목의 출원을 한 군집으로 묶은 표준오차에서도 네 계수는 1% 수준에서 유지된다. 제목당 가장 이른 출원 1건만 남긴 표본(N = 473), 조립 단계 공정을 제조공정으로 세지 않는 좁은 정의(N = 908), 직접 접합의 무관한 용법 68건을 뺀 표본(N = 860)에서도 핵심 계수는 유지되며, 좁은 정의에서는 조립 단독형 46.8%, 통합형 37.2%, 공정 단독형 16.0%로 통합형이 최다 유형이라는 기술통계는 정의에 따라 달라지지만 회귀 결과는 그대로다. 제목에</w:t>
+        <w:t xml:space="preserve">Table 5는 표본과 변수 정의를 바꾸어 다시 추정한 핵심 계수와 가설 판정이다. 같은 제목의 출원을 한 군집으로 묶은 표준오차에서도 네 계수는 1% 수준에서 유지된다. 제목당 가장 이른 출원 1건만 남긴 표본(N = 473), 조립 단계 공정을 제조공정으로 세지 않는 좁은 정의(N = 908), 직접 접합의 무관한 용법 68건을 뺀 표본(N = 860)에서도 핵심 계수는 유지되며, 좁은 정의에서는 조립 단독형 46.8%, 통합형 37.2%, 공정 단독형 16.0%로 통합형이 최다 유형이라는 기술통계는 정의에 따라 달라지지만 회귀 결과는 그대로다. 제목에</w:t>
       </w:r>
       <w:r>
         <w:t xml:space="preserve"> </w:t>
@@ -3498,7 +3926,7 @@
           <w:b/>
           <w:bCs/>
         </w:rPr>
-        <w:t xml:space="preserve">Table 4.</w:t>
+        <w:t xml:space="preserve">Table 5.</w:t>
       </w:r>
       <w:r>
         <w:t xml:space="preserve"> </w:t>
@@ -3694,7 +4122,7 @@
                 <w:sz w:val="13"/>
                 <w:szCs w:val="13"/>
               </w:rPr>
-              <w:t xml:space="preserve">Baseline (Tables 2–3)</w:t>
+              <w:t xml:space="preserve">Baseline (Tables 3–4)</w:t>
             </w:r>
           </w:p>
         </w:tc>

</xml_diff>

<commit_message>
KAIS_short: fix Korean particles after renumbered table references
Co-Authored-By: Claude Fable 5.1 <noreply@anthropic.com>
Claude-Session: https://claude.ai/code/session_01SvckvZxt3hAXTDPnm8YPEC
</commit_message>
<xml_diff>
--- a/journal/manuscript_v24_ko_KAIS_short.docx
+++ b/journal/manuscript_v24_ko_KAIS_short.docx
@@ -884,7 +884,7 @@
         <w:pStyle w:val="BodyText"/>
       </w:pPr>
       <w:r>
-        <w:t xml:space="preserve">Table 2은 변수를 정의한다. 기술범위(breadth)는 출원별 H01L21·H01L24 계열의 서로 다른 CPC 서브그룹 수로 분류 기호의 수로 범위를 재는 Lerner[29]의 방식을 두 클래스 안에 적용한 것이다. 통합형은 최소 breadth가 2이고 단독형은 1이므로, 보유 클래스마다 최소 1개 기호를 차감한 유형 최소치 조정 CPC 범위(breadth_adj)를 탐색적 지표로 따로 둔다. 자료에 출원인 정보가 없으므로 출원청 계수는 관할권의 인과효과가 아니라 해당 출원청에 제출된 발명 포트폴리오의 조건부 구성 차이로 해석한다.</w:t>
+        <w:t xml:space="preserve">Table 2는 변수를 정의한다. 기술범위(breadth)는 출원별 H01L21·H01L24 계열의 서로 다른 CPC 서브그룹 수로 분류 기호의 수로 범위를 재는 Lerner[29]의 방식을 두 클래스 안에 적용한 것이다. 통합형은 최소 breadth가 2이고 단독형은 1이므로, 보유 클래스마다 최소 1개 기호를 차감한 유형 최소치 조정 CPC 범위(breadth_adj)를 탐색적 지표로 따로 둔다. 자료에 출원인 정보가 없으므로 출원청 계수는 관할권의 인과효과가 아니라 해당 출원청에 제출된 발명 포트폴리오의 조건부 구성 차이로 해석한다.</w:t>
       </w:r>
     </w:p>
     <w:p>
@@ -1484,7 +1484,7 @@
         <w:pStyle w:val="BodyText"/>
       </w:pPr>
       <w:r>
-        <w:t xml:space="preserve">Table 3는 기술범위의 음이항 추정 결과다. 미국 출원청 기준으로 중국 출원청 출원은 기대 CPC 서브그룹 수가 약 21% 적고(IRR 0.785, p &lt; 0.01, 95% CI 0.695–0.887), PCT 경로 출원은 약 17% 적다(IRR 0.826, p &lt; 0.01). 한국, 대만, EPO는 미국과 다르지 않으며 일본은 10% 수준에서만 유의하다. 이 결과는 H3a를 지지한다. 출원연도의 IRR은 1.015이지만 2010년 이후 표본만 보면 부호가 반대로 바뀌므로(IRR 0.970, p &lt; 0.01) 범위의 시간 추세에 대해서는 결론을 내리지 않는다.</w:t>
+        <w:t xml:space="preserve">Table 3은 기술범위의 음이항 추정 결과다. 미국 출원청 기준으로 중국 출원청 출원은 기대 CPC 서브그룹 수가 약 21% 적고(IRR 0.785, p &lt; 0.01, 95% CI 0.695–0.887), PCT 경로 출원은 약 17% 적다(IRR 0.826, p &lt; 0.01). 한국, 대만, EPO는 미국과 다르지 않으며 일본은 10% 수준에서만 유의하다. 이 결과는 H3a를 지지한다. 출원연도의 IRR은 1.015이지만 2010년 이후 표본만 보면 부호가 반대로 바뀌므로(IRR 0.970, p &lt; 0.01) 범위의 시간 추세에 대해서는 결론을 내리지 않는다.</w:t>
       </w:r>
     </w:p>
     <w:p>
@@ -2311,7 +2311,7 @@
         <w:pStyle w:val="FirstParagraph"/>
       </w:pPr>
       <w:r>
-        <w:t xml:space="preserve">Table 4은 조립 단독형을 기준으로 한 다항 로짓이며, Fig. 2는 기술범위와 출원연도를 바꾸었을 때 세 유형의 평균 예측확률이다. 세부 분류가 하나 늘 때마다 통합형일 상대위험은 40% 높아지고(RRR 1.403, p &lt; 0.01, 95% CI 1.321–1.489) 공정 단독형일 상대위험은 10% 낮아지며(RRR 0.905, p &lt; 0.05), 기술범위가 3인 출원의 통합형 예측확률은 0.26이지만 8인 출원은 0.68이다. 유형과 기술범위가 같은 CPC 정보에서 만들어지므로 H1은 통합형의 구성적 특징으로서 지지된다. 공정 단독형의 상대위험은 해마다 약 8.7%씩 낮아지고(RRR 0.913, p &lt; 0.01, 95% CI 0.887–0.940) 통합형은 전 기간의 선형 추세로는 변하지 않는다(RRR 0.993). 2010년 출원의 공정 단독형 예측확률은 0.27, 2022년 출원은 0.12다. H2는 지지된다. 중국 출원청 출원은 공정 단독형일 상대위험이 2.7배 높고(RRR 2.687, p &lt; 0.01, 95% CI 1.566–4.611) PCT 경로도 높지만(RRR 1.997, p &lt; 0.05), 통합형 방정식에서는 어느 출원청 계수도 유의하지 않아 범위와 시점을 통제하면 경계를 넘는 특허의 비중 자체는 출원청 사이에 다르지 않다. 공정 단독형 평균 예측확률은 중국 출원청 0.255, 미국 출원청 0.143이다. 시기별로 보면 공정 단독형의 비중은 2014년 이전 43.6%에서 2015–2019년 14.8%, 2020–2024년 10.4%로 계속 줄었고, 통합형은 31.3%에서 62.2%로 늘었다가 44.3%로 낮아졌으며, 조립 단독형은 25.1%와 23.0%에서 45.4%로 늘었다. 기간 더미를 넣은 다항 로짓에서도 공정 단독형의 상대위험은 2014년 이전 대비 0.273과 0.101(모두 p &lt; 0.01)로 낮아지고 통합형은 1.707(p = 0.09)에서 0.762(비유의)로 내려온다.</w:t>
+        <w:t xml:space="preserve">Table 4는 조립 단독형을 기준으로 한 다항 로짓이며, Fig. 2는 기술범위와 출원연도를 바꾸었을 때 세 유형의 평균 예측확률이다. 세부 분류가 하나 늘 때마다 통합형일 상대위험은 40% 높아지고(RRR 1.403, p &lt; 0.01, 95% CI 1.321–1.489) 공정 단독형일 상대위험은 10% 낮아지며(RRR 0.905, p &lt; 0.05), 기술범위가 3인 출원의 통합형 예측확률은 0.26이지만 8인 출원은 0.68이다. 유형과 기술범위가 같은 CPC 정보에서 만들어지므로 H1은 통합형의 구성적 특징으로서 지지된다. 공정 단독형의 상대위험은 해마다 약 8.7%씩 낮아지고(RRR 0.913, p &lt; 0.01, 95% CI 0.887–0.940) 통합형은 전 기간의 선형 추세로는 변하지 않는다(RRR 0.993). 2010년 출원의 공정 단독형 예측확률은 0.27, 2022년 출원은 0.12다. H2는 지지된다. 중국 출원청 출원은 공정 단독형일 상대위험이 2.7배 높고(RRR 2.687, p &lt; 0.01, 95% CI 1.566–4.611) PCT 경로도 높지만(RRR 1.997, p &lt; 0.05), 통합형 방정식에서는 어느 출원청 계수도 유의하지 않아 범위와 시점을 통제하면 경계를 넘는 특허의 비중 자체는 출원청 사이에 다르지 않다. 공정 단독형 평균 예측확률은 중국 출원청 0.255, 미국 출원청 0.143이다. 시기별로 보면 공정 단독형의 비중은 2014년 이전 43.6%에서 2015–2019년 14.8%, 2020–2024년 10.4%로 계속 줄었고, 통합형은 31.3%에서 62.2%로 늘었다가 44.3%로 낮아졌으며, 조립 단독형은 25.1%와 23.0%에서 45.4%로 늘었다. 기간 더미를 넣은 다항 로짓에서도 공정 단독형의 상대위험은 2014년 이전 대비 0.273과 0.101(모두 p &lt; 0.01)로 낮아지고 통합형은 1.707(p = 0.09)에서 0.762(비유의)로 내려온다.</w:t>
       </w:r>
     </w:p>
     <w:p>

</xml_diff>